<commit_message>
Created MySQL database, imported the dataset & did initial checks
</commit_message>
<xml_diff>
--- a/docs/project_documentation.docx
+++ b/docs/project_documentation.docx
@@ -1563,6 +1563,58 @@
         </w:rPr>
         <w:t>~$*</w:t>
       </w:r>
+    </w:p>
+    <w:p>
+      <w:pPr>
+        <w:rPr>
+          <w:rFonts w:ascii="Times New Roman" w:hAnsi="Times New Roman" w:cs="Times New Roman"/>
+          <w:sz w:val="24"/>
+          <w:szCs w:val="24"/>
+        </w:rPr>
+      </w:pPr>
+      <w:r>
+        <w:rPr>
+          <w:rFonts w:ascii="Times New Roman" w:hAnsi="Times New Roman" w:cs="Times New Roman"/>
+          <w:sz w:val="24"/>
+          <w:szCs w:val="24"/>
+        </w:rPr>
+        <w:t># Cleaned datasets</w:t>
+      </w:r>
+      <w:r>
+        <w:rPr>
+          <w:rFonts w:ascii="Times New Roman" w:hAnsi="Times New Roman" w:cs="Times New Roman"/>
+          <w:sz w:val="24"/>
+          <w:szCs w:val="24"/>
+        </w:rPr>
+        <w:t xml:space="preserve"> </w:t>
+      </w:r>
+    </w:p>
+    <w:p>
+      <w:pPr>
+        <w:rPr>
+          <w:rFonts w:ascii="Times New Roman" w:hAnsi="Times New Roman" w:cs="Times New Roman"/>
+          <w:sz w:val="24"/>
+          <w:szCs w:val="24"/>
+        </w:rPr>
+      </w:pPr>
+      <w:r>
+        <w:rPr>
+          <w:rFonts w:ascii="Times New Roman" w:hAnsi="Times New Roman" w:cs="Times New Roman"/>
+          <w:sz w:val="24"/>
+          <w:szCs w:val="24"/>
+        </w:rPr>
+        <w:lastRenderedPageBreak/>
+        <w:t>data/cleaned/*.csv</w:t>
+      </w:r>
+    </w:p>
+    <w:p>
+      <w:pPr>
+        <w:rPr>
+          <w:rFonts w:ascii="Times New Roman" w:hAnsi="Times New Roman" w:cs="Times New Roman"/>
+          <w:sz w:val="24"/>
+          <w:szCs w:val="24"/>
+        </w:rPr>
+      </w:pPr>
     </w:p>
     <w:p>
       <w:pPr>
@@ -2573,6 +2625,7 @@
           <w:sz w:val="24"/>
           <w:szCs w:val="24"/>
         </w:rPr>
+        <w:lastRenderedPageBreak/>
         <w:t xml:space="preserve">Check the Git: </w:t>
       </w:r>
     </w:p>
@@ -2664,7 +2717,6 @@
           <w:sz w:val="24"/>
           <w:szCs w:val="24"/>
         </w:rPr>
-        <w:lastRenderedPageBreak/>
         <w:t>git status</w:t>
       </w:r>
     </w:p>
@@ -3501,6 +3553,7 @@
           <w:sz w:val="24"/>
           <w:szCs w:val="24"/>
         </w:rPr>
+        <w:lastRenderedPageBreak/>
         <w:t>Data_df.info()</w:t>
       </w:r>
     </w:p>
@@ -3565,7 +3618,6 @@
           <w:sz w:val="24"/>
           <w:szCs w:val="24"/>
         </w:rPr>
-        <w:lastRenderedPageBreak/>
         <w:t>Data_df[“Country Name”].nunique()</w:t>
       </w:r>
     </w:p>
@@ -5201,7 +5253,6 @@
           <w:sz w:val="32"/>
           <w:szCs w:val="32"/>
         </w:rPr>
-        <w:lastRenderedPageBreak/>
         <w:t># Findings:</w:t>
       </w:r>
     </w:p>
@@ -5698,6 +5749,7 @@
           <w:sz w:val="24"/>
           <w:szCs w:val="24"/>
         </w:rPr>
+        <w:lastRenderedPageBreak/>
         <w:t>Some</w:t>
       </w:r>
       <w:r>
@@ -5774,7 +5826,6 @@
           <w:szCs w:val="24"/>
           <w:lang w:val="en-US"/>
         </w:rPr>
-        <w:lastRenderedPageBreak/>
         <w:t>Df_long.shape</w:t>
       </w:r>
     </w:p>
@@ -5937,6 +5988,7 @@
       <w:r>
         <w:rPr>
           <w:rFonts w:ascii="Times New Roman" w:hAnsi="Times New Roman" w:cs="Times New Roman"/>
+          <w:noProof/>
           <w:sz w:val="24"/>
           <w:szCs w:val="24"/>
         </w:rPr>
@@ -6075,6 +6127,7 @@
           <w:sz w:val="24"/>
           <w:szCs w:val="24"/>
         </w:rPr>
+        <w:lastRenderedPageBreak/>
         <w:t xml:space="preserve">Total observations created: </w:t>
       </w:r>
       <w:r>
@@ -6192,7 +6245,6 @@
           <w:sz w:val="24"/>
           <w:szCs w:val="24"/>
         </w:rPr>
-        <w:lastRenderedPageBreak/>
         <w:t>useful_data_percentage = (df_long["Value"].notna().mean()*100)</w:t>
       </w:r>
     </w:p>
@@ -6613,6 +6665,1094 @@
         </w:rPr>
         <w:t>git push</w:t>
       </w:r>
+      <w:r>
+        <w:rPr>
+          <w:rFonts w:ascii="Times New Roman" w:hAnsi="Times New Roman" w:cs="Times New Roman"/>
+          <w:sz w:val="24"/>
+          <w:szCs w:val="24"/>
+        </w:rPr>
+        <w:t xml:space="preserve">  </w:t>
+      </w:r>
+      <w:r>
+        <w:rPr>
+          <w:rFonts w:ascii="Times New Roman" w:hAnsi="Times New Roman" w:cs="Times New Roman"/>
+          <w:sz w:val="24"/>
+          <w:szCs w:val="24"/>
+        </w:rPr>
+        <w:tab/>
+      </w:r>
+      <w:r>
+        <w:rPr>
+          <w:rFonts w:ascii="Times New Roman" w:hAnsi="Times New Roman" w:cs="Times New Roman"/>
+          <w:sz w:val="24"/>
+          <w:szCs w:val="24"/>
+        </w:rPr>
+        <w:tab/>
+        <w:t>// failed bcz of the large cleaned dataset.</w:t>
+      </w:r>
+    </w:p>
+    <w:p>
+      <w:pPr>
+        <w:rPr>
+          <w:rFonts w:ascii="Times New Roman" w:hAnsi="Times New Roman" w:cs="Times New Roman"/>
+          <w:sz w:val="24"/>
+          <w:szCs w:val="24"/>
+        </w:rPr>
+      </w:pPr>
+      <w:r>
+        <w:rPr>
+          <w:rFonts w:ascii="Times New Roman" w:hAnsi="Times New Roman" w:cs="Times New Roman"/>
+          <w:sz w:val="24"/>
+          <w:szCs w:val="24"/>
+        </w:rPr>
+        <w:t xml:space="preserve">Now, </w:t>
+      </w:r>
+    </w:p>
+    <w:p>
+      <w:pPr>
+        <w:rPr>
+          <w:rFonts w:ascii="Times New Roman" w:hAnsi="Times New Roman" w:cs="Times New Roman"/>
+          <w:sz w:val="24"/>
+          <w:szCs w:val="24"/>
+        </w:rPr>
+      </w:pPr>
+      <w:r>
+        <w:rPr>
+          <w:rFonts w:ascii="Times New Roman" w:hAnsi="Times New Roman" w:cs="Times New Roman"/>
+          <w:sz w:val="24"/>
+          <w:szCs w:val="24"/>
+        </w:rPr>
+        <w:t>git rm --cached data/cleaned/world_bank_long_format.csv</w:t>
+      </w:r>
+    </w:p>
+    <w:p>
+      <w:pPr>
+        <w:rPr>
+          <w:rFonts w:ascii="Times New Roman" w:hAnsi="Times New Roman" w:cs="Times New Roman"/>
+          <w:sz w:val="24"/>
+          <w:szCs w:val="24"/>
+        </w:rPr>
+      </w:pPr>
+      <w:r>
+        <w:rPr>
+          <w:rFonts w:ascii="Times New Roman" w:hAnsi="Times New Roman" w:cs="Times New Roman"/>
+          <w:sz w:val="24"/>
+          <w:szCs w:val="24"/>
+        </w:rPr>
+        <w:t>Add this to .gitignore</w:t>
+      </w:r>
+      <w:r>
+        <w:rPr>
+          <w:rFonts w:ascii="Times New Roman" w:hAnsi="Times New Roman" w:cs="Times New Roman"/>
+          <w:sz w:val="24"/>
+          <w:szCs w:val="24"/>
+        </w:rPr>
+        <w:t xml:space="preserve">:   </w:t>
+      </w:r>
+      <w:r>
+        <w:rPr>
+          <w:rFonts w:ascii="Times New Roman" w:hAnsi="Times New Roman" w:cs="Times New Roman"/>
+          <w:sz w:val="24"/>
+          <w:szCs w:val="24"/>
+        </w:rPr>
+        <w:t xml:space="preserve"> </w:t>
+      </w:r>
+    </w:p>
+    <w:p>
+      <w:pPr>
+        <w:rPr>
+          <w:rFonts w:ascii="Times New Roman" w:hAnsi="Times New Roman" w:cs="Times New Roman"/>
+          <w:sz w:val="24"/>
+          <w:szCs w:val="24"/>
+        </w:rPr>
+      </w:pPr>
+      <w:r>
+        <w:rPr>
+          <w:rFonts w:ascii="Times New Roman" w:hAnsi="Times New Roman" w:cs="Times New Roman"/>
+          <w:sz w:val="24"/>
+          <w:szCs w:val="24"/>
+        </w:rPr>
+        <w:t># Cleaned datasets</w:t>
+      </w:r>
+      <w:r>
+        <w:rPr>
+          <w:rFonts w:ascii="Times New Roman" w:hAnsi="Times New Roman" w:cs="Times New Roman"/>
+          <w:sz w:val="24"/>
+          <w:szCs w:val="24"/>
+        </w:rPr>
+        <w:t xml:space="preserve"> </w:t>
+      </w:r>
+    </w:p>
+    <w:p>
+      <w:pPr>
+        <w:rPr>
+          <w:rFonts w:ascii="Times New Roman" w:hAnsi="Times New Roman" w:cs="Times New Roman"/>
+          <w:sz w:val="24"/>
+          <w:szCs w:val="24"/>
+        </w:rPr>
+      </w:pPr>
+      <w:r>
+        <w:rPr>
+          <w:rFonts w:ascii="Times New Roman" w:hAnsi="Times New Roman" w:cs="Times New Roman"/>
+          <w:sz w:val="24"/>
+          <w:szCs w:val="24"/>
+        </w:rPr>
+        <w:t>data/cleaned/*.csv</w:t>
+      </w:r>
+    </w:p>
+    <w:p>
+      <w:pPr>
+        <w:rPr>
+          <w:rFonts w:ascii="Times New Roman" w:hAnsi="Times New Roman" w:cs="Times New Roman"/>
+          <w:sz w:val="24"/>
+          <w:szCs w:val="24"/>
+        </w:rPr>
+      </w:pPr>
+      <w:r>
+        <w:rPr>
+          <w:rFonts w:ascii="Times New Roman" w:hAnsi="Times New Roman" w:cs="Times New Roman"/>
+          <w:sz w:val="24"/>
+          <w:szCs w:val="24"/>
+        </w:rPr>
+        <w:t>git add .gitignore</w:t>
+      </w:r>
+    </w:p>
+    <w:p>
+      <w:pPr>
+        <w:rPr>
+          <w:rFonts w:ascii="Times New Roman" w:hAnsi="Times New Roman" w:cs="Times New Roman"/>
+          <w:sz w:val="24"/>
+          <w:szCs w:val="24"/>
+        </w:rPr>
+      </w:pPr>
+      <w:r>
+        <w:rPr>
+          <w:rFonts w:ascii="Times New Roman" w:hAnsi="Times New Roman" w:cs="Times New Roman"/>
+          <w:sz w:val="24"/>
+          <w:szCs w:val="24"/>
+        </w:rPr>
+        <w:t>git commit --amend --no-edit</w:t>
+      </w:r>
+    </w:p>
+    <w:p>
+      <w:pPr>
+        <w:rPr>
+          <w:rFonts w:ascii="Times New Roman" w:hAnsi="Times New Roman" w:cs="Times New Roman"/>
+          <w:sz w:val="24"/>
+          <w:szCs w:val="24"/>
+        </w:rPr>
+      </w:pPr>
+      <w:r>
+        <w:rPr>
+          <w:rFonts w:ascii="Times New Roman" w:hAnsi="Times New Roman" w:cs="Times New Roman"/>
+          <w:sz w:val="24"/>
+          <w:szCs w:val="24"/>
+        </w:rPr>
+        <w:t>git push</w:t>
+      </w:r>
+    </w:p>
+    <w:p>
+      <w:pPr>
+        <w:rPr>
+          <w:rFonts w:ascii="Times New Roman" w:hAnsi="Times New Roman" w:cs="Times New Roman"/>
+          <w:sz w:val="24"/>
+          <w:szCs w:val="24"/>
+        </w:rPr>
+      </w:pPr>
+    </w:p>
+    <w:p>
+      <w:pPr>
+        <w:rPr>
+          <w:rFonts w:ascii="Times New Roman" w:hAnsi="Times New Roman" w:cs="Times New Roman"/>
+          <w:b/>
+          <w:bCs/>
+          <w:sz w:val="32"/>
+          <w:szCs w:val="32"/>
+        </w:rPr>
+      </w:pPr>
+      <w:r>
+        <w:rPr>
+          <w:rFonts w:ascii="Times New Roman" w:hAnsi="Times New Roman" w:cs="Times New Roman"/>
+          <w:b/>
+          <w:bCs/>
+          <w:sz w:val="32"/>
+          <w:szCs w:val="32"/>
+        </w:rPr>
+        <w:t>MY SQL WORKBENCH</w:t>
+      </w:r>
+      <w:r>
+        <w:rPr>
+          <w:rFonts w:ascii="Times New Roman" w:hAnsi="Times New Roman" w:cs="Times New Roman"/>
+          <w:b/>
+          <w:bCs/>
+          <w:sz w:val="32"/>
+          <w:szCs w:val="32"/>
+        </w:rPr>
+        <w:t>:</w:t>
+      </w:r>
+    </w:p>
+    <w:p>
+      <w:pPr>
+        <w:rPr>
+          <w:rFonts w:ascii="Times New Roman" w:hAnsi="Times New Roman" w:cs="Times New Roman"/>
+          <w:sz w:val="24"/>
+          <w:szCs w:val="24"/>
+        </w:rPr>
+      </w:pPr>
+      <w:r>
+        <w:rPr>
+          <w:rFonts w:ascii="Times New Roman" w:hAnsi="Times New Roman" w:cs="Times New Roman"/>
+          <w:sz w:val="24"/>
+          <w:szCs w:val="24"/>
+        </w:rPr>
+        <w:t>create database world_bank_database;</w:t>
+      </w:r>
+    </w:p>
+    <w:p>
+      <w:pPr>
+        <w:rPr>
+          <w:rFonts w:ascii="Times New Roman" w:hAnsi="Times New Roman" w:cs="Times New Roman"/>
+          <w:sz w:val="24"/>
+          <w:szCs w:val="24"/>
+        </w:rPr>
+      </w:pPr>
+      <w:r>
+        <w:rPr>
+          <w:rFonts w:ascii="Times New Roman" w:hAnsi="Times New Roman" w:cs="Times New Roman"/>
+          <w:sz w:val="24"/>
+          <w:szCs w:val="24"/>
+        </w:rPr>
+        <w:lastRenderedPageBreak/>
+        <w:t>use world_bank_database;</w:t>
+      </w:r>
+    </w:p>
+    <w:p>
+      <w:pPr>
+        <w:rPr>
+          <w:rFonts w:ascii="Times New Roman" w:hAnsi="Times New Roman" w:cs="Times New Roman"/>
+          <w:b/>
+          <w:bCs/>
+          <w:sz w:val="24"/>
+          <w:szCs w:val="24"/>
+        </w:rPr>
+      </w:pPr>
+      <w:r>
+        <w:rPr>
+          <w:rFonts w:ascii="Times New Roman" w:hAnsi="Times New Roman" w:cs="Times New Roman"/>
+          <w:sz w:val="24"/>
+          <w:szCs w:val="24"/>
+        </w:rPr>
+        <w:t xml:space="preserve">save new sql file into local sql folder – </w:t>
+      </w:r>
+      <w:r>
+        <w:rPr>
+          <w:rFonts w:ascii="Times New Roman" w:hAnsi="Times New Roman" w:cs="Times New Roman"/>
+          <w:b/>
+          <w:bCs/>
+          <w:sz w:val="24"/>
+          <w:szCs w:val="24"/>
+        </w:rPr>
+        <w:t>01_db_setup.sql</w:t>
+      </w:r>
+    </w:p>
+    <w:p>
+      <w:pPr>
+        <w:rPr>
+          <w:rFonts w:ascii="Times New Roman" w:hAnsi="Times New Roman" w:cs="Times New Roman"/>
+          <w:sz w:val="24"/>
+          <w:szCs w:val="24"/>
+        </w:rPr>
+      </w:pPr>
+      <w:r>
+        <w:rPr>
+          <w:rFonts w:ascii="Times New Roman" w:hAnsi="Times New Roman" w:cs="Times New Roman"/>
+          <w:sz w:val="24"/>
+          <w:szCs w:val="24"/>
+        </w:rPr>
+        <w:t>Right click – set as default schema</w:t>
+      </w:r>
+    </w:p>
+    <w:p>
+      <w:pPr>
+        <w:rPr>
+          <w:rFonts w:ascii="Times New Roman" w:hAnsi="Times New Roman" w:cs="Times New Roman"/>
+          <w:sz w:val="24"/>
+          <w:szCs w:val="24"/>
+        </w:rPr>
+      </w:pPr>
+      <w:r>
+        <w:rPr>
+          <w:rFonts w:ascii="Times New Roman" w:hAnsi="Times New Roman" w:cs="Times New Roman"/>
+          <w:sz w:val="24"/>
+          <w:szCs w:val="24"/>
+        </w:rPr>
+        <w:t>create table world_bank(</w:t>
+      </w:r>
+    </w:p>
+    <w:p>
+      <w:pPr>
+        <w:rPr>
+          <w:rFonts w:ascii="Times New Roman" w:hAnsi="Times New Roman" w:cs="Times New Roman"/>
+          <w:sz w:val="24"/>
+          <w:szCs w:val="24"/>
+        </w:rPr>
+      </w:pPr>
+      <w:r>
+        <w:rPr>
+          <w:rFonts w:ascii="Times New Roman" w:hAnsi="Times New Roman" w:cs="Times New Roman"/>
+          <w:sz w:val="24"/>
+          <w:szCs w:val="24"/>
+        </w:rPr>
+        <w:t xml:space="preserve">    </w:t>
+      </w:r>
+      <w:r>
+        <w:rPr>
+          <w:rFonts w:ascii="Times New Roman" w:hAnsi="Times New Roman" w:cs="Times New Roman"/>
+          <w:sz w:val="24"/>
+          <w:szCs w:val="24"/>
+        </w:rPr>
+        <w:t>country_name varchar(100) not null,</w:t>
+      </w:r>
+    </w:p>
+    <w:p>
+      <w:pPr>
+        <w:rPr>
+          <w:rFonts w:ascii="Times New Roman" w:hAnsi="Times New Roman" w:cs="Times New Roman"/>
+          <w:sz w:val="24"/>
+          <w:szCs w:val="24"/>
+        </w:rPr>
+      </w:pPr>
+      <w:r>
+        <w:rPr>
+          <w:rFonts w:ascii="Times New Roman" w:hAnsi="Times New Roman" w:cs="Times New Roman"/>
+          <w:sz w:val="24"/>
+          <w:szCs w:val="24"/>
+        </w:rPr>
+        <w:t xml:space="preserve">    country_code varchar(50) not null,</w:t>
+      </w:r>
+    </w:p>
+    <w:p>
+      <w:pPr>
+        <w:rPr>
+          <w:rFonts w:ascii="Times New Roman" w:hAnsi="Times New Roman" w:cs="Times New Roman"/>
+          <w:sz w:val="24"/>
+          <w:szCs w:val="24"/>
+        </w:rPr>
+      </w:pPr>
+      <w:r>
+        <w:rPr>
+          <w:rFonts w:ascii="Times New Roman" w:hAnsi="Times New Roman" w:cs="Times New Roman"/>
+          <w:sz w:val="24"/>
+          <w:szCs w:val="24"/>
+        </w:rPr>
+        <w:t xml:space="preserve">    indicator_name varchar(100) not null,</w:t>
+      </w:r>
+    </w:p>
+    <w:p>
+      <w:pPr>
+        <w:rPr>
+          <w:rFonts w:ascii="Times New Roman" w:hAnsi="Times New Roman" w:cs="Times New Roman"/>
+          <w:sz w:val="24"/>
+          <w:szCs w:val="24"/>
+        </w:rPr>
+      </w:pPr>
+      <w:r>
+        <w:rPr>
+          <w:rFonts w:ascii="Times New Roman" w:hAnsi="Times New Roman" w:cs="Times New Roman"/>
+          <w:sz w:val="24"/>
+          <w:szCs w:val="24"/>
+        </w:rPr>
+        <w:t xml:space="preserve">    indicator_code varchar(50) not null,</w:t>
+      </w:r>
+    </w:p>
+    <w:p>
+      <w:pPr>
+        <w:rPr>
+          <w:rFonts w:ascii="Times New Roman" w:hAnsi="Times New Roman" w:cs="Times New Roman"/>
+          <w:sz w:val="24"/>
+          <w:szCs w:val="24"/>
+        </w:rPr>
+      </w:pPr>
+      <w:r>
+        <w:rPr>
+          <w:rFonts w:ascii="Times New Roman" w:hAnsi="Times New Roman" w:cs="Times New Roman"/>
+          <w:sz w:val="24"/>
+          <w:szCs w:val="24"/>
+        </w:rPr>
+        <w:t xml:space="preserve">    year int not null,</w:t>
+      </w:r>
+    </w:p>
+    <w:p>
+      <w:pPr>
+        <w:rPr>
+          <w:rFonts w:ascii="Times New Roman" w:hAnsi="Times New Roman" w:cs="Times New Roman"/>
+          <w:sz w:val="24"/>
+          <w:szCs w:val="24"/>
+        </w:rPr>
+      </w:pPr>
+      <w:r>
+        <w:rPr>
+          <w:rFonts w:ascii="Times New Roman" w:hAnsi="Times New Roman" w:cs="Times New Roman"/>
+          <w:sz w:val="24"/>
+          <w:szCs w:val="24"/>
+        </w:rPr>
+        <w:t xml:space="preserve">    value double not null,</w:t>
+      </w:r>
+    </w:p>
+    <w:p>
+      <w:pPr>
+        <w:rPr>
+          <w:rFonts w:ascii="Times New Roman" w:hAnsi="Times New Roman" w:cs="Times New Roman"/>
+          <w:sz w:val="24"/>
+          <w:szCs w:val="24"/>
+        </w:rPr>
+      </w:pPr>
+      <w:r>
+        <w:rPr>
+          <w:rFonts w:ascii="Times New Roman" w:hAnsi="Times New Roman" w:cs="Times New Roman"/>
+          <w:sz w:val="24"/>
+          <w:szCs w:val="24"/>
+        </w:rPr>
+        <w:t xml:space="preserve">    primary key(country_code, indicator_code, year));</w:t>
+      </w:r>
+    </w:p>
+    <w:p>
+      <w:pPr>
+        <w:rPr>
+          <w:rFonts w:ascii="Times New Roman" w:hAnsi="Times New Roman" w:cs="Times New Roman"/>
+          <w:sz w:val="24"/>
+          <w:szCs w:val="24"/>
+        </w:rPr>
+      </w:pPr>
+    </w:p>
+    <w:p>
+      <w:pPr>
+        <w:rPr>
+          <w:rFonts w:ascii="Times New Roman" w:hAnsi="Times New Roman" w:cs="Times New Roman"/>
+          <w:sz w:val="24"/>
+          <w:szCs w:val="24"/>
+        </w:rPr>
+      </w:pPr>
+      <w:r>
+        <w:rPr>
+          <w:rFonts w:ascii="Times New Roman" w:hAnsi="Times New Roman" w:cs="Times New Roman"/>
+          <w:sz w:val="24"/>
+          <w:szCs w:val="24"/>
+        </w:rPr>
+        <w:t>I</w:t>
+      </w:r>
+      <w:r>
+        <w:rPr>
+          <w:rFonts w:ascii="Times New Roman" w:hAnsi="Times New Roman" w:cs="Times New Roman"/>
+          <w:sz w:val="24"/>
+          <w:szCs w:val="24"/>
+        </w:rPr>
+        <w:t>nstead of guessing the length of the variable – you can test in python:</w:t>
+      </w:r>
+    </w:p>
+    <w:p>
+      <w:pPr>
+        <w:rPr>
+          <w:rFonts w:ascii="Times New Roman" w:hAnsi="Times New Roman" w:cs="Times New Roman"/>
+          <w:sz w:val="24"/>
+          <w:szCs w:val="24"/>
+        </w:rPr>
+      </w:pPr>
+      <w:r>
+        <w:rPr>
+          <w:rFonts w:ascii="Times New Roman" w:hAnsi="Times New Roman" w:cs="Times New Roman"/>
+          <w:sz w:val="24"/>
+          <w:szCs w:val="24"/>
+        </w:rPr>
+        <w:t>df_long["Indicator Name"].str.len().max()</w:t>
+      </w:r>
+    </w:p>
+    <w:p>
+      <w:pPr>
+        <w:rPr>
+          <w:rFonts w:ascii="Times New Roman" w:hAnsi="Times New Roman" w:cs="Times New Roman"/>
+          <w:sz w:val="24"/>
+          <w:szCs w:val="24"/>
+        </w:rPr>
+      </w:pPr>
+      <w:r>
+        <w:rPr>
+          <w:rFonts w:ascii="Times New Roman" w:hAnsi="Times New Roman" w:cs="Times New Roman"/>
+          <w:sz w:val="24"/>
+          <w:szCs w:val="24"/>
+        </w:rPr>
+        <w:t>df_long["Country Name"].str.len().max()</w:t>
+      </w:r>
+    </w:p>
+    <w:p>
+      <w:pPr>
+        <w:rPr>
+          <w:rFonts w:ascii="Times New Roman" w:hAnsi="Times New Roman" w:cs="Times New Roman"/>
+          <w:sz w:val="24"/>
+          <w:szCs w:val="24"/>
+        </w:rPr>
+      </w:pPr>
+    </w:p>
+    <w:p>
+      <w:pPr>
+        <w:rPr>
+          <w:rFonts w:ascii="Times New Roman" w:hAnsi="Times New Roman" w:cs="Times New Roman"/>
+          <w:b/>
+          <w:bCs/>
+          <w:sz w:val="24"/>
+          <w:szCs w:val="24"/>
+        </w:rPr>
+      </w:pPr>
+      <w:r>
+        <w:rPr>
+          <w:rFonts w:ascii="Times New Roman" w:hAnsi="Times New Roman" w:cs="Times New Roman"/>
+          <w:sz w:val="24"/>
+          <w:szCs w:val="24"/>
+        </w:rPr>
+        <w:t xml:space="preserve">1 table can only have 1 Primary Key – That 1 primary key can consists of multiple columns = </w:t>
+      </w:r>
+      <w:r>
+        <w:rPr>
+          <w:rFonts w:ascii="Times New Roman" w:hAnsi="Times New Roman" w:cs="Times New Roman"/>
+          <w:b/>
+          <w:bCs/>
+          <w:sz w:val="24"/>
+          <w:szCs w:val="24"/>
+        </w:rPr>
+        <w:t>Composite Primary Key</w:t>
+      </w:r>
+      <w:r>
+        <w:rPr>
+          <w:rFonts w:ascii="Times New Roman" w:hAnsi="Times New Roman" w:cs="Times New Roman"/>
+          <w:b/>
+          <w:bCs/>
+          <w:sz w:val="24"/>
+          <w:szCs w:val="24"/>
+        </w:rPr>
+        <w:t>.</w:t>
+      </w:r>
+    </w:p>
+    <w:p>
+      <w:pPr>
+        <w:rPr>
+          <w:rFonts w:ascii="Times New Roman" w:hAnsi="Times New Roman" w:cs="Times New Roman"/>
+          <w:b/>
+          <w:bCs/>
+          <w:sz w:val="24"/>
+          <w:szCs w:val="24"/>
+        </w:rPr>
+      </w:pPr>
+    </w:p>
+    <w:p>
+      <w:pPr>
+        <w:rPr>
+          <w:rFonts w:ascii="Times New Roman" w:hAnsi="Times New Roman" w:cs="Times New Roman"/>
+          <w:b/>
+          <w:bCs/>
+          <w:sz w:val="24"/>
+          <w:szCs w:val="24"/>
+        </w:rPr>
+      </w:pPr>
+      <w:r>
+        <w:rPr>
+          <w:rFonts w:ascii="Times New Roman" w:hAnsi="Times New Roman" w:cs="Times New Roman"/>
+          <w:b/>
+          <w:bCs/>
+          <w:sz w:val="24"/>
+          <w:szCs w:val="24"/>
+        </w:rPr>
+        <w:t>Load the .csv file into MySQL:</w:t>
+      </w:r>
+    </w:p>
+    <w:p>
+      <w:pPr>
+        <w:rPr>
+          <w:rFonts w:ascii="Times New Roman" w:hAnsi="Times New Roman" w:cs="Times New Roman"/>
+          <w:sz w:val="24"/>
+          <w:szCs w:val="24"/>
+        </w:rPr>
+      </w:pPr>
+      <w:r>
+        <w:rPr>
+          <w:rFonts w:ascii="Times New Roman" w:hAnsi="Times New Roman" w:cs="Times New Roman"/>
+          <w:sz w:val="24"/>
+          <w:szCs w:val="24"/>
+        </w:rPr>
+        <w:t>SHOW VARIABLES LIKE 'local_infile';</w:t>
+      </w:r>
+      <w:r>
+        <w:rPr>
+          <w:rFonts w:ascii="Times New Roman" w:hAnsi="Times New Roman" w:cs="Times New Roman"/>
+          <w:sz w:val="24"/>
+          <w:szCs w:val="24"/>
+        </w:rPr>
+        <w:t xml:space="preserve"> // </w:t>
+      </w:r>
+      <w:r>
+        <w:rPr>
+          <w:rFonts w:ascii="Times New Roman" w:hAnsi="Times New Roman" w:cs="Times New Roman"/>
+          <w:b/>
+          <w:bCs/>
+          <w:sz w:val="24"/>
+          <w:szCs w:val="24"/>
+        </w:rPr>
+        <w:t>ON</w:t>
+      </w:r>
+      <w:r>
+        <w:rPr>
+          <w:rFonts w:ascii="Times New Roman" w:hAnsi="Times New Roman" w:cs="Times New Roman"/>
+          <w:sz w:val="24"/>
+          <w:szCs w:val="24"/>
+        </w:rPr>
+        <w:t xml:space="preserve"> = good to go</w:t>
+      </w:r>
+      <w:r>
+        <w:rPr>
+          <w:rFonts w:ascii="Times New Roman" w:hAnsi="Times New Roman" w:cs="Times New Roman"/>
+          <w:sz w:val="24"/>
+          <w:szCs w:val="24"/>
+        </w:rPr>
+        <w:t>;</w:t>
+      </w:r>
+    </w:p>
+    <w:p>
+      <w:pPr>
+        <w:rPr>
+          <w:rFonts w:ascii="Times New Roman" w:hAnsi="Times New Roman" w:cs="Times New Roman"/>
+          <w:sz w:val="24"/>
+          <w:szCs w:val="24"/>
+        </w:rPr>
+      </w:pPr>
+      <w:r>
+        <w:rPr>
+          <w:rFonts w:ascii="Times New Roman" w:hAnsi="Times New Roman" w:cs="Times New Roman"/>
+          <w:b/>
+          <w:bCs/>
+          <w:sz w:val="24"/>
+          <w:szCs w:val="24"/>
+        </w:rPr>
+        <w:t>Off</w:t>
+      </w:r>
+      <w:r>
+        <w:rPr>
+          <w:rFonts w:ascii="Times New Roman" w:hAnsi="Times New Roman" w:cs="Times New Roman"/>
+          <w:sz w:val="24"/>
+          <w:szCs w:val="24"/>
+        </w:rPr>
+        <w:t xml:space="preserve"> then,</w:t>
+      </w:r>
+    </w:p>
+    <w:p>
+      <w:pPr>
+        <w:rPr>
+          <w:rFonts w:ascii="Times New Roman" w:hAnsi="Times New Roman" w:cs="Times New Roman"/>
+          <w:sz w:val="24"/>
+          <w:szCs w:val="24"/>
+        </w:rPr>
+      </w:pPr>
+      <w:r>
+        <w:rPr>
+          <w:rFonts w:ascii="Times New Roman" w:hAnsi="Times New Roman" w:cs="Times New Roman"/>
+          <w:sz w:val="24"/>
+          <w:szCs w:val="24"/>
+        </w:rPr>
+        <w:t>SELECT VERSION();</w:t>
+      </w:r>
+    </w:p>
+    <w:p>
+      <w:pPr>
+        <w:rPr>
+          <w:rFonts w:ascii="Times New Roman" w:hAnsi="Times New Roman" w:cs="Times New Roman"/>
+          <w:sz w:val="24"/>
+          <w:szCs w:val="24"/>
+        </w:rPr>
+      </w:pPr>
+      <w:r>
+        <w:rPr>
+          <w:rFonts w:ascii="Times New Roman" w:hAnsi="Times New Roman" w:cs="Times New Roman"/>
+          <w:sz w:val="24"/>
+          <w:szCs w:val="24"/>
+        </w:rPr>
+        <w:t>SET GLOBAL local_infile = 1;</w:t>
+      </w:r>
+    </w:p>
+    <w:p>
+      <w:pPr>
+        <w:rPr>
+          <w:rFonts w:ascii="Times New Roman" w:hAnsi="Times New Roman" w:cs="Times New Roman"/>
+          <w:sz w:val="24"/>
+          <w:szCs w:val="24"/>
+        </w:rPr>
+      </w:pPr>
+      <w:r>
+        <w:rPr>
+          <w:rFonts w:ascii="Times New Roman" w:hAnsi="Times New Roman" w:cs="Times New Roman"/>
+          <w:sz w:val="24"/>
+          <w:szCs w:val="24"/>
+        </w:rPr>
+        <w:t>SHOW VARIABLES LIKE 'local_infile';</w:t>
+      </w:r>
+      <w:r>
+        <w:rPr>
+          <w:rFonts w:ascii="Times New Roman" w:hAnsi="Times New Roman" w:cs="Times New Roman"/>
+          <w:sz w:val="24"/>
+          <w:szCs w:val="24"/>
+        </w:rPr>
+        <w:t xml:space="preserve"> // It will now show O</w:t>
+      </w:r>
+      <w:r>
+        <w:rPr>
+          <w:rFonts w:ascii="Times New Roman" w:hAnsi="Times New Roman" w:cs="Times New Roman"/>
+          <w:sz w:val="24"/>
+          <w:szCs w:val="24"/>
+        </w:rPr>
+        <w:t>N</w:t>
+      </w:r>
+    </w:p>
+    <w:p>
+      <w:pPr>
+        <w:rPr>
+          <w:rFonts w:ascii="Times New Roman" w:hAnsi="Times New Roman" w:cs="Times New Roman"/>
+          <w:sz w:val="24"/>
+          <w:szCs w:val="24"/>
+        </w:rPr>
+      </w:pPr>
+    </w:p>
+    <w:p>
+      <w:pPr>
+        <w:rPr>
+          <w:rFonts w:ascii="Times New Roman" w:hAnsi="Times New Roman" w:cs="Times New Roman"/>
+          <w:sz w:val="24"/>
+          <w:szCs w:val="24"/>
+        </w:rPr>
+      </w:pPr>
+      <w:r>
+        <w:rPr>
+          <w:rFonts w:ascii="Times New Roman" w:hAnsi="Times New Roman" w:cs="Times New Roman"/>
+          <w:sz w:val="24"/>
+          <w:szCs w:val="24"/>
+        </w:rPr>
+        <w:t>LOAD DATA LOCAL INFILE</w:t>
+      </w:r>
+    </w:p>
+    <w:p>
+      <w:pPr>
+        <w:rPr>
+          <w:rFonts w:ascii="Times New Roman" w:hAnsi="Times New Roman" w:cs="Times New Roman"/>
+          <w:sz w:val="24"/>
+          <w:szCs w:val="24"/>
+        </w:rPr>
+      </w:pPr>
+      <w:r>
+        <w:rPr>
+          <w:rFonts w:ascii="Times New Roman" w:hAnsi="Times New Roman" w:cs="Times New Roman"/>
+          <w:sz w:val="24"/>
+          <w:szCs w:val="24"/>
+        </w:rPr>
+        <w:t>'D:/world_bank_development_analysis/data/cleaned/world_bank_long_format.csv'</w:t>
+      </w:r>
+    </w:p>
+    <w:p>
+      <w:pPr>
+        <w:rPr>
+          <w:rFonts w:ascii="Times New Roman" w:hAnsi="Times New Roman" w:cs="Times New Roman"/>
+          <w:sz w:val="24"/>
+          <w:szCs w:val="24"/>
+        </w:rPr>
+      </w:pPr>
+      <w:r>
+        <w:rPr>
+          <w:rFonts w:ascii="Times New Roman" w:hAnsi="Times New Roman" w:cs="Times New Roman"/>
+          <w:sz w:val="24"/>
+          <w:szCs w:val="24"/>
+        </w:rPr>
+        <w:t>INTO TABLE world_bank</w:t>
+      </w:r>
+    </w:p>
+    <w:p>
+      <w:pPr>
+        <w:rPr>
+          <w:rFonts w:ascii="Times New Roman" w:hAnsi="Times New Roman" w:cs="Times New Roman"/>
+          <w:sz w:val="24"/>
+          <w:szCs w:val="24"/>
+        </w:rPr>
+      </w:pPr>
+      <w:r>
+        <w:rPr>
+          <w:rFonts w:ascii="Times New Roman" w:hAnsi="Times New Roman" w:cs="Times New Roman"/>
+          <w:sz w:val="24"/>
+          <w:szCs w:val="24"/>
+        </w:rPr>
+        <w:t>FIELDS TERMINATED BY ','</w:t>
+      </w:r>
+    </w:p>
+    <w:p>
+      <w:pPr>
+        <w:rPr>
+          <w:rFonts w:ascii="Times New Roman" w:hAnsi="Times New Roman" w:cs="Times New Roman"/>
+          <w:sz w:val="24"/>
+          <w:szCs w:val="24"/>
+        </w:rPr>
+      </w:pPr>
+      <w:r>
+        <w:rPr>
+          <w:rFonts w:ascii="Times New Roman" w:hAnsi="Times New Roman" w:cs="Times New Roman"/>
+          <w:sz w:val="24"/>
+          <w:szCs w:val="24"/>
+        </w:rPr>
+        <w:t>ENCLOSED BY '"'</w:t>
+      </w:r>
+    </w:p>
+    <w:p>
+      <w:pPr>
+        <w:rPr>
+          <w:rFonts w:ascii="Times New Roman" w:hAnsi="Times New Roman" w:cs="Times New Roman"/>
+          <w:sz w:val="24"/>
+          <w:szCs w:val="24"/>
+        </w:rPr>
+      </w:pPr>
+      <w:r>
+        <w:rPr>
+          <w:rFonts w:ascii="Times New Roman" w:hAnsi="Times New Roman" w:cs="Times New Roman"/>
+          <w:sz w:val="24"/>
+          <w:szCs w:val="24"/>
+        </w:rPr>
+        <w:t>LINES TERMINATED BY '\n'</w:t>
+      </w:r>
+    </w:p>
+    <w:p>
+      <w:pPr>
+        <w:rPr>
+          <w:rFonts w:ascii="Times New Roman" w:hAnsi="Times New Roman" w:cs="Times New Roman"/>
+          <w:sz w:val="24"/>
+          <w:szCs w:val="24"/>
+        </w:rPr>
+      </w:pPr>
+      <w:r>
+        <w:rPr>
+          <w:rFonts w:ascii="Times New Roman" w:hAnsi="Times New Roman" w:cs="Times New Roman"/>
+          <w:sz w:val="24"/>
+          <w:szCs w:val="24"/>
+        </w:rPr>
+        <w:t>IGNORE 1 ROWS;</w:t>
+      </w:r>
+    </w:p>
+    <w:p>
+      <w:pPr>
+        <w:rPr>
+          <w:rFonts w:ascii="Times New Roman" w:hAnsi="Times New Roman" w:cs="Times New Roman"/>
+          <w:b/>
+          <w:bCs/>
+          <w:sz w:val="24"/>
+          <w:szCs w:val="24"/>
+        </w:rPr>
+      </w:pPr>
+      <w:r>
+        <w:rPr>
+          <w:rFonts w:ascii="Times New Roman" w:hAnsi="Times New Roman" w:cs="Times New Roman"/>
+          <w:b/>
+          <w:bCs/>
+          <w:sz w:val="24"/>
+          <w:szCs w:val="24"/>
+        </w:rPr>
+        <w:lastRenderedPageBreak/>
+        <w:t>/* Inspect the Data */</w:t>
+      </w:r>
+    </w:p>
+    <w:p>
+      <w:pPr>
+        <w:rPr>
+          <w:rFonts w:ascii="Times New Roman" w:hAnsi="Times New Roman" w:cs="Times New Roman"/>
+          <w:sz w:val="24"/>
+          <w:szCs w:val="24"/>
+        </w:rPr>
+      </w:pPr>
+      <w:r>
+        <w:rPr>
+          <w:rFonts w:ascii="Times New Roman" w:hAnsi="Times New Roman" w:cs="Times New Roman"/>
+          <w:sz w:val="24"/>
+          <w:szCs w:val="24"/>
+        </w:rPr>
+        <w:t xml:space="preserve">select COUNT(*) FROM world_bank;  </w:t>
+      </w:r>
+      <w:r>
+        <w:rPr>
+          <w:rFonts w:ascii="Times New Roman" w:hAnsi="Times New Roman" w:cs="Times New Roman"/>
+          <w:sz w:val="24"/>
+          <w:szCs w:val="24"/>
+        </w:rPr>
+        <w:t xml:space="preserve">// </w:t>
+      </w:r>
+      <w:r>
+        <w:rPr>
+          <w:rFonts w:ascii="Times New Roman" w:hAnsi="Times New Roman" w:cs="Times New Roman"/>
+          <w:sz w:val="24"/>
+          <w:szCs w:val="24"/>
+        </w:rPr>
+        <w:t>9015914</w:t>
+      </w:r>
+      <w:r>
+        <w:rPr>
+          <w:rFonts w:ascii="Times New Roman" w:hAnsi="Times New Roman" w:cs="Times New Roman"/>
+          <w:sz w:val="24"/>
+          <w:szCs w:val="24"/>
+        </w:rPr>
+        <w:t xml:space="preserve"> rows loaded</w:t>
+      </w:r>
+    </w:p>
+    <w:p>
+      <w:pPr>
+        <w:rPr>
+          <w:rFonts w:ascii="Times New Roman" w:hAnsi="Times New Roman" w:cs="Times New Roman"/>
+          <w:sz w:val="24"/>
+          <w:szCs w:val="24"/>
+        </w:rPr>
+      </w:pPr>
+      <w:r>
+        <w:rPr>
+          <w:rFonts w:ascii="Times New Roman" w:hAnsi="Times New Roman" w:cs="Times New Roman"/>
+          <w:sz w:val="24"/>
+          <w:szCs w:val="24"/>
+        </w:rPr>
+        <w:t>select * from world_bank limit 10;</w:t>
+      </w:r>
+    </w:p>
+    <w:p>
+      <w:pPr>
+        <w:rPr>
+          <w:rFonts w:ascii="Times New Roman" w:hAnsi="Times New Roman" w:cs="Times New Roman"/>
+          <w:sz w:val="24"/>
+          <w:szCs w:val="24"/>
+        </w:rPr>
+      </w:pPr>
+      <w:r>
+        <w:rPr>
+          <w:rFonts w:ascii="Times New Roman" w:hAnsi="Times New Roman" w:cs="Times New Roman"/>
+          <w:sz w:val="24"/>
+          <w:szCs w:val="24"/>
+        </w:rPr>
+        <w:t>select min(year), max(year) from world_bank;</w:t>
+      </w:r>
+    </w:p>
+    <w:p>
+      <w:pPr>
+        <w:rPr>
+          <w:rFonts w:ascii="Times New Roman" w:hAnsi="Times New Roman" w:cs="Times New Roman"/>
+          <w:sz w:val="24"/>
+          <w:szCs w:val="24"/>
+        </w:rPr>
+      </w:pPr>
+      <w:r>
+        <w:rPr>
+          <w:rFonts w:ascii="Times New Roman" w:hAnsi="Times New Roman" w:cs="Times New Roman"/>
+          <w:sz w:val="24"/>
+          <w:szCs w:val="24"/>
+        </w:rPr>
+        <w:t>select count(distinct country_code) from world_bank;</w:t>
+      </w:r>
+    </w:p>
+    <w:p>
+      <w:pPr>
+        <w:rPr>
+          <w:rFonts w:ascii="Times New Roman" w:hAnsi="Times New Roman" w:cs="Times New Roman"/>
+          <w:sz w:val="24"/>
+          <w:szCs w:val="24"/>
+        </w:rPr>
+      </w:pPr>
+      <w:r>
+        <w:rPr>
+          <w:rFonts w:ascii="Times New Roman" w:hAnsi="Times New Roman" w:cs="Times New Roman"/>
+          <w:sz w:val="24"/>
+          <w:szCs w:val="24"/>
+        </w:rPr>
+        <w:t>select count(distinct indicator_code) from world_bank;</w:t>
+      </w:r>
+    </w:p>
+    <w:p>
+      <w:pPr>
+        <w:rPr>
+          <w:rFonts w:ascii="Times New Roman" w:hAnsi="Times New Roman" w:cs="Times New Roman"/>
+          <w:sz w:val="24"/>
+          <w:szCs w:val="24"/>
+        </w:rPr>
+      </w:pPr>
+      <w:r>
+        <w:rPr>
+          <w:rFonts w:ascii="Times New Roman" w:hAnsi="Times New Roman" w:cs="Times New Roman"/>
+          <w:sz w:val="24"/>
+          <w:szCs w:val="24"/>
+        </w:rPr>
+        <w:t>select count(*) from world_bank where value is null;</w:t>
+      </w:r>
+    </w:p>
+    <w:p>
+      <w:pPr>
+        <w:rPr>
+          <w:rFonts w:ascii="Times New Roman" w:hAnsi="Times New Roman" w:cs="Times New Roman"/>
+          <w:sz w:val="24"/>
+          <w:szCs w:val="24"/>
+        </w:rPr>
+      </w:pPr>
+    </w:p>
+    <w:p>
+      <w:pPr>
+        <w:rPr>
+          <w:rFonts w:ascii="Times New Roman" w:hAnsi="Times New Roman" w:cs="Times New Roman"/>
+          <w:sz w:val="24"/>
+          <w:szCs w:val="24"/>
+        </w:rPr>
+      </w:pPr>
+      <w:r>
+        <w:rPr>
+          <w:rFonts w:ascii="Times New Roman" w:hAnsi="Times New Roman" w:cs="Times New Roman"/>
+          <w:sz w:val="24"/>
+          <w:szCs w:val="24"/>
+        </w:rPr>
+        <w:t>git add .</w:t>
+      </w:r>
+    </w:p>
+    <w:p>
+      <w:pPr>
+        <w:rPr>
+          <w:rFonts w:ascii="Times New Roman" w:hAnsi="Times New Roman" w:cs="Times New Roman"/>
+          <w:sz w:val="24"/>
+          <w:szCs w:val="24"/>
+        </w:rPr>
+      </w:pPr>
+      <w:r>
+        <w:rPr>
+          <w:rFonts w:ascii="Times New Roman" w:hAnsi="Times New Roman" w:cs="Times New Roman"/>
+          <w:sz w:val="24"/>
+          <w:szCs w:val="24"/>
+        </w:rPr>
+        <w:t>git commit -m “Created MySQL database &amp; imported the database”</w:t>
+      </w:r>
+    </w:p>
+    <w:p>
+      <w:pPr>
+        <w:rPr>
+          <w:rFonts w:ascii="Times New Roman" w:hAnsi="Times New Roman" w:cs="Times New Roman"/>
+          <w:sz w:val="24"/>
+          <w:szCs w:val="24"/>
+        </w:rPr>
+      </w:pPr>
+      <w:r>
+        <w:rPr>
+          <w:rFonts w:ascii="Times New Roman" w:hAnsi="Times New Roman" w:cs="Times New Roman"/>
+          <w:sz w:val="24"/>
+          <w:szCs w:val="24"/>
+        </w:rPr>
+        <w:t>git push</w:t>
+      </w:r>
+    </w:p>
+    <w:p>
+      <w:pPr>
+        <w:rPr>
+          <w:rFonts w:ascii="Times New Roman" w:hAnsi="Times New Roman" w:cs="Times New Roman"/>
+          <w:sz w:val="24"/>
+          <w:szCs w:val="24"/>
+        </w:rPr>
+      </w:pPr>
     </w:p>
     <w:p>
       <w:pPr>

</xml_diff>